<commit_message>
Speech Speech: keep only the poem indented; restore the in-paragraph quotations
Co-Authored-By: Claude Sonnet 5.5 <noreply@anthropic.com>
</commit_message>
<xml_diff>
--- a/content-src/docx/R TLS 2002 01 25 Hill Speech Speech.docx
+++ b/content-src/docx/R TLS 2002 01 25 Hill Speech Speech.docx
@@ -45,13 +45,13 @@
         <w:t xml:space="preserve">One of the students whom Geoffrey Hill taught at Cambridge (1981–8) used to quote his tutor in letters to friends. This, for example, was Hill announcing the next term’s reading list (the ellipses indicating lugubrious pauses): </w:t>
       </w:r>
       <w:r>
-        <w:t xml:space="preserve">&lt;quote&gt;</w:t>
+        <w:t xml:space="preserve">“</w:t>
       </w:r>
       <w:r>
         <w:t xml:space="preserve">And English Literature . . . in the Sixteenth Century . . . (Excluding Drama) . . . by C. S. Lewis . . . with whose . . . The Lion . . . the Witch . . . and the Wardrobe . . . you may be more happily familiar.</w:t>
       </w:r>
       <w:r>
-        <w:t xml:space="preserve">&lt;/quote&gt;</w:t>
+        <w:t xml:space="preserve">”</w:t>
       </w:r>
     </w:p>
     <w:p>
@@ -175,7 +175,7 @@
         <w:t xml:space="preserve"> absorbs them into the texture of the poem. These pressures include a debased public language, an amnesiac public, a culture given over solely to commerce and sensation, a contemptuous lack of seriousness and attention. Years ago, in a discussion of Yeats’s “The Circus Animals’ Desertion”, Hill asked: </w:t>
       </w:r>
       <w:r>
-        <w:t xml:space="preserve">&lt;quote&gt;</w:t>
+        <w:t xml:space="preserve">“</w:t>
       </w:r>
       <w:r>
         <w:t xml:space="preserve">How is it possible, though, to revoke ‘masterful images’ in images that are themselves masterful? How can one renounce ‘completion’ with epithets and rhyme patterns that in themselves retain a certain </w:t>
@@ -184,7 +184,7 @@
         <w:t xml:space="preserve">repleteness?</w:t>
       </w:r>
       <w:r>
-        <w:t xml:space="preserve">&lt;/quote&gt;</w:t>
+        <w:t xml:space="preserve">”</w:t>
       </w:r>
       <w:r>
         <w:t xml:space="preserve"> And elsewhere, discussing Pound, he observed that</w:t>

</xml_diff>